<commit_message>
Fix prompt injection boundary in grounded prompts
</commit_message>
<xml_diff>
--- a/reports/DryRun_PromptInjection_Remediation_20261026.docx
+++ b/reports/DryRun_PromptInjection_Remediation_20261026.docx
@@ -259,7 +259,7 @@
     </w:p>
     <w:p>
       <w:r>
-        <w:t>テスト実行: 未実施（AIテストプロジェクトのビルドは成功）</w:t>
+        <w:t>テスト実行: PASS — SupportCaseManager.Ai.Tests 1,159件、ソリューション全体 --no-build 1,696件</w:t>
       </w:r>
     </w:p>
     <w:p>
@@ -286,7 +286,7 @@
     </w:p>
     <w:p>
       <w:r>
-        <w:t>次の確認は、関連テストの実行と、修正後の同じPRに対するDryRun Security再スキャンです。再スキャンでFindingが閉じるまでは、セキュリティ検出の解消済みとは扱いません。</w:t>
+        <w:t>ソリューション全体の再ビルドは、起動中のSupportCaseManager.Appが出力DLLをロックしたためコピー段階で失敗しました。実行中のアプリは終了せず、既存ビルドを使った全テストは成功しています。</w:t>
       </w:r>
     </w:p>
     <w:p>

</xml_diff>